<commit_message>
Make standalone deployment the primary path
- scripts/download_release_assets.sh pulls the trained checkpoint +
  demo index from the GitHub Release (they're gitignored, too big for
  a normal repo) into the right data/index/ paths.
- DOCUMENTATION.md and README.md now lead with "run this yourself on
  your own GPU" instead of only documenting how to reach our A100
  through a tunnel -- that path stays as a documented fallback for a
  live walkthrough, not the only way to see it work.
- README.md was still describing day-1 status (BoxCars not downloaded,
  no A100 access, no web demo) even though all of that shipped --
  rewrote it to match what's actually in the repo.
</commit_message>
<xml_diff>
--- a/presentation/DOCUMENTATION.docx
+++ b/presentation/DOCUMENTATION.docx
@@ -2020,13 +2020,13 @@
       </w:r>
     </w:p>
     <w:bookmarkEnd w:id="16"/>
-    <w:bookmarkStart w:id="19" w:name="как-развернуть-для-проверки-жюри"/>
+    <w:bookmarkStart w:id="20" w:name="как-развернуть"/>
     <w:p>
       <w:pPr>
         <w:pStyle w:val="Heading1"/>
       </w:pPr>
       <w:r>
-        <w:t xml:space="preserve">Как развернуть (для проверки жюри)</w:t>
+        <w:t xml:space="preserve">Как развернуть</w:t>
       </w:r>
     </w:p>
     <w:p>
@@ -2034,28 +2034,28 @@
         <w:pStyle w:val="FirstParagraph"/>
       </w:pPr>
       <w:r>
-        <w:t xml:space="preserve">Инференс (детектор + дообученный эмбеддер + поиск) требует GPU и уже</w:t>
-      </w:r>
-      <w:r>
-        <w:t xml:space="preserve"> </w:t>
-      </w:r>
-      <w:r>
-        <w:t xml:space="preserve">запущен нами на выделенном сервере — жюри не нужно поднимать модели</w:t>
-      </w:r>
-      <w:r>
-        <w:t xml:space="preserve"> </w:t>
-      </w:r>
-      <w:r>
-        <w:t xml:space="preserve">самостоятельно, только веб-клиент.</w:t>
-      </w:r>
-    </w:p>
-    <w:bookmarkStart w:id="17" w:name="открыть-доступ-к-api"/>
+        <w:t xml:space="preserve">Два независимых способа. Первый — полностью автономный, у себя на GPU.</w:t>
+      </w:r>
+      <w:r>
+        <w:t xml:space="preserve"> </w:t>
+      </w:r>
+      <w:r>
+        <w:t xml:space="preserve">Второй — быстрый просмотр через наш уже поднятый сервер (для демонстрации</w:t>
+      </w:r>
+      <w:r>
+        <w:t xml:space="preserve"> </w:t>
+      </w:r>
+      <w:r>
+        <w:t xml:space="preserve">вживую, требует пароль, который передаётся отдельно).</w:t>
+      </w:r>
+    </w:p>
+    <w:bookmarkStart w:id="18" w:name="X580203c720faa95e40aac269819f42e1270ec69"/>
     <w:p>
       <w:pPr>
         <w:pStyle w:val="Heading2"/>
       </w:pPr>
       <w:r>
-        <w:t xml:space="preserve">1. Открыть доступ к API</w:t>
+        <w:t xml:space="preserve">Способ 1 — полностью у себя (рекомендуется для проверки)</w:t>
       </w:r>
     </w:p>
     <w:p>
@@ -2063,7 +2063,353 @@
         <w:pStyle w:val="FirstParagraph"/>
       </w:pPr>
       <w:r>
-        <w:t xml:space="preserve">API слушает</w:t>
+        <w:t xml:space="preserve">Нужна машина с GPU (CUDA) — на CPU тоже запустится, но инференс будет</w:t>
+      </w:r>
+      <w:r>
+        <w:t xml:space="preserve"> </w:t>
+      </w:r>
+      <w:r>
+        <w:t xml:space="preserve">медленным. Обученный чекпоинт (1.2 ГБ) и демо-индекс не лежат в git</w:t>
+      </w:r>
+      <w:r>
+        <w:t xml:space="preserve"> </w:t>
+      </w:r>
+      <w:r>
+        <w:t xml:space="preserve">(слишком тяжёлые для обычного репозитория) — они в</w:t>
+      </w:r>
+      <w:r>
+        <w:t xml:space="preserve"> </w:t>
+      </w:r>
+      <w:hyperlink r:id="rId17">
+        <w:r>
+          <w:rPr>
+            <w:rStyle w:val="Hyperlink"/>
+          </w:rPr>
+          <w:t xml:space="preserve">GitHub Release</w:t>
+        </w:r>
+      </w:hyperlink>
+      <w:r>
+        <w:t xml:space="preserve"> </w:t>
+      </w:r>
+      <w:r>
+        <w:t xml:space="preserve">этого репозитория.</w:t>
+      </w:r>
+    </w:p>
+    <w:p>
+      <w:pPr>
+        <w:pStyle w:val="SourceCode"/>
+      </w:pPr>
+      <w:r>
+        <w:rPr>
+          <w:rStyle w:val="FunctionTok"/>
+        </w:rPr>
+        <w:t xml:space="preserve">git</w:t>
+      </w:r>
+      <w:r>
+        <w:rPr>
+          <w:rStyle w:val="NormalTok"/>
+        </w:rPr>
+        <w:t xml:space="preserve"> clone https://github.com/GeDeKo/lct2026-vehicle-reid.git</w:t>
+      </w:r>
+      <w:r>
+        <w:br/>
+      </w:r>
+      <w:r>
+        <w:rPr>
+          <w:rStyle w:val="BuiltInTok"/>
+        </w:rPr>
+        <w:t xml:space="preserve">cd</w:t>
+      </w:r>
+      <w:r>
+        <w:rPr>
+          <w:rStyle w:val="NormalTok"/>
+        </w:rPr>
+        <w:t xml:space="preserve"> lct2026-vehicle-reid</w:t>
+      </w:r>
+      <w:r>
+        <w:br/>
+      </w:r>
+      <w:r>
+        <w:br/>
+      </w:r>
+      <w:r>
+        <w:rPr>
+          <w:rStyle w:val="ExtensionTok"/>
+        </w:rPr>
+        <w:t xml:space="preserve">python3</w:t>
+      </w:r>
+      <w:r>
+        <w:rPr>
+          <w:rStyle w:val="NormalTok"/>
+        </w:rPr>
+        <w:t xml:space="preserve"> </w:t>
+      </w:r>
+      <w:r>
+        <w:rPr>
+          <w:rStyle w:val="AttributeTok"/>
+        </w:rPr>
+        <w:t xml:space="preserve">-m</w:t>
+      </w:r>
+      <w:r>
+        <w:rPr>
+          <w:rStyle w:val="NormalTok"/>
+        </w:rPr>
+        <w:t xml:space="preserve"> venv .venv </w:t>
+      </w:r>
+      <w:r>
+        <w:rPr>
+          <w:rStyle w:val="KeywordTok"/>
+        </w:rPr>
+        <w:t xml:space="preserve">&amp;&amp;</w:t>
+      </w:r>
+      <w:r>
+        <w:rPr>
+          <w:rStyle w:val="NormalTok"/>
+        </w:rPr>
+        <w:t xml:space="preserve"> </w:t>
+      </w:r>
+      <w:r>
+        <w:rPr>
+          <w:rStyle w:val="BuiltInTok"/>
+        </w:rPr>
+        <w:t xml:space="preserve">source</w:t>
+      </w:r>
+      <w:r>
+        <w:rPr>
+          <w:rStyle w:val="NormalTok"/>
+        </w:rPr>
+        <w:t xml:space="preserve"> .venv/bin/activate</w:t>
+      </w:r>
+      <w:r>
+        <w:br/>
+      </w:r>
+      <w:r>
+        <w:rPr>
+          <w:rStyle w:val="ExtensionTok"/>
+        </w:rPr>
+        <w:t xml:space="preserve">pip</w:t>
+      </w:r>
+      <w:r>
+        <w:rPr>
+          <w:rStyle w:val="NormalTok"/>
+        </w:rPr>
+        <w:t xml:space="preserve"> install </w:t>
+      </w:r>
+      <w:r>
+        <w:rPr>
+          <w:rStyle w:val="AttributeTok"/>
+        </w:rPr>
+        <w:t xml:space="preserve">-r</w:t>
+      </w:r>
+      <w:r>
+        <w:rPr>
+          <w:rStyle w:val="NormalTok"/>
+        </w:rPr>
+        <w:t xml:space="preserve"> requirements.txt</w:t>
+      </w:r>
+      <w:r>
+        <w:br/>
+      </w:r>
+      <w:r>
+        <w:rPr>
+          <w:rStyle w:val="ExtensionTok"/>
+        </w:rPr>
+        <w:t xml:space="preserve">pip</w:t>
+      </w:r>
+      <w:r>
+        <w:rPr>
+          <w:rStyle w:val="NormalTok"/>
+        </w:rPr>
+        <w:t xml:space="preserve"> install torch torchvision </w:t>
+      </w:r>
+      <w:r>
+        <w:rPr>
+          <w:rStyle w:val="AttributeTok"/>
+        </w:rPr>
+        <w:t xml:space="preserve">--index-url</w:t>
+      </w:r>
+      <w:r>
+        <w:rPr>
+          <w:rStyle w:val="NormalTok"/>
+        </w:rPr>
+        <w:t xml:space="preserve"> https://download.pytorch.org/whl/cu121  </w:t>
+      </w:r>
+      <w:r>
+        <w:rPr>
+          <w:rStyle w:val="CommentTok"/>
+        </w:rPr>
+        <w:t xml:space="preserve"># или cpu-сборка</w:t>
+      </w:r>
+      <w:r>
+        <w:br/>
+      </w:r>
+      <w:r>
+        <w:br/>
+      </w:r>
+      <w:r>
+        <w:rPr>
+          <w:rStyle w:val="ExtensionTok"/>
+        </w:rPr>
+        <w:t xml:space="preserve">./scripts/download_release_assets.sh</w:t>
+      </w:r>
+      <w:r>
+        <w:rPr>
+          <w:rStyle w:val="NormalTok"/>
+        </w:rPr>
+        <w:t xml:space="preserve">   </w:t>
+      </w:r>
+      <w:r>
+        <w:rPr>
+          <w:rStyle w:val="CommentTok"/>
+        </w:rPr>
+        <w:t xml:space="preserve"># чекпоинт + демо-индекс из Release</w:t>
+      </w:r>
+      <w:r>
+        <w:br/>
+      </w:r>
+      <w:r>
+        <w:br/>
+      </w:r>
+      <w:r>
+        <w:rPr>
+          <w:rStyle w:val="ExtensionTok"/>
+        </w:rPr>
+        <w:t xml:space="preserve">uvicorn</w:t>
+      </w:r>
+      <w:r>
+        <w:rPr>
+          <w:rStyle w:val="NormalTok"/>
+        </w:rPr>
+        <w:t xml:space="preserve"> src.api.main:app </w:t>
+      </w:r>
+      <w:r>
+        <w:rPr>
+          <w:rStyle w:val="AttributeTok"/>
+        </w:rPr>
+        <w:t xml:space="preserve">--host</w:t>
+      </w:r>
+      <w:r>
+        <w:rPr>
+          <w:rStyle w:val="NormalTok"/>
+        </w:rPr>
+        <w:t xml:space="preserve"> 0.0.0.0 </w:t>
+      </w:r>
+      <w:r>
+        <w:rPr>
+          <w:rStyle w:val="AttributeTok"/>
+        </w:rPr>
+        <w:t xml:space="preserve">--port</w:t>
+      </w:r>
+      <w:r>
+        <w:rPr>
+          <w:rStyle w:val="NormalTok"/>
+        </w:rPr>
+        <w:t xml:space="preserve"> 8800   </w:t>
+      </w:r>
+      <w:r>
+        <w:rPr>
+          <w:rStyle w:val="CommentTok"/>
+        </w:rPr>
+        <w:t xml:space="preserve"># бэкенд</w:t>
+      </w:r>
+    </w:p>
+    <w:p>
+      <w:pPr>
+        <w:pStyle w:val="FirstParagraph"/>
+      </w:pPr>
+      <w:r>
+        <w:t xml:space="preserve">В отдельном терминале — фронтенд:</w:t>
+      </w:r>
+    </w:p>
+    <w:p>
+      <w:pPr>
+        <w:pStyle w:val="SourceCode"/>
+      </w:pPr>
+      <w:r>
+        <w:rPr>
+          <w:rStyle w:val="BuiltInTok"/>
+        </w:rPr>
+        <w:t xml:space="preserve">cd</w:t>
+      </w:r>
+      <w:r>
+        <w:rPr>
+          <w:rStyle w:val="NormalTok"/>
+        </w:rPr>
+        <w:t xml:space="preserve"> web</w:t>
+      </w:r>
+      <w:r>
+        <w:br/>
+      </w:r>
+      <w:r>
+        <w:rPr>
+          <w:rStyle w:val="ExtensionTok"/>
+        </w:rPr>
+        <w:t xml:space="preserve">npm</w:t>
+      </w:r>
+      <w:r>
+        <w:rPr>
+          <w:rStyle w:val="NormalTok"/>
+        </w:rPr>
+        <w:t xml:space="preserve"> install</w:t>
+      </w:r>
+      <w:r>
+        <w:br/>
+      </w:r>
+      <w:r>
+        <w:rPr>
+          <w:rStyle w:val="ExtensionTok"/>
+        </w:rPr>
+        <w:t xml:space="preserve">npm</w:t>
+      </w:r>
+      <w:r>
+        <w:rPr>
+          <w:rStyle w:val="NormalTok"/>
+        </w:rPr>
+        <w:t xml:space="preserve"> run build </w:t>
+      </w:r>
+      <w:r>
+        <w:rPr>
+          <w:rStyle w:val="KeywordTok"/>
+        </w:rPr>
+        <w:t xml:space="preserve">&amp;&amp;</w:t>
+      </w:r>
+      <w:r>
+        <w:rPr>
+          <w:rStyle w:val="NormalTok"/>
+        </w:rPr>
+        <w:t xml:space="preserve"> </w:t>
+      </w:r>
+      <w:r>
+        <w:rPr>
+          <w:rStyle w:val="ExtensionTok"/>
+        </w:rPr>
+        <w:t xml:space="preserve">npx</w:t>
+      </w:r>
+      <w:r>
+        <w:rPr>
+          <w:rStyle w:val="NormalTok"/>
+        </w:rPr>
+        <w:t xml:space="preserve"> vite preview </w:t>
+      </w:r>
+      <w:r>
+        <w:rPr>
+          <w:rStyle w:val="AttributeTok"/>
+        </w:rPr>
+        <w:t xml:space="preserve">--port</w:t>
+      </w:r>
+      <w:r>
+        <w:rPr>
+          <w:rStyle w:val="NormalTok"/>
+        </w:rPr>
+        <w:t xml:space="preserve"> 5500</w:t>
+      </w:r>
+    </w:p>
+    <w:p>
+      <w:pPr>
+        <w:pStyle w:val="FirstParagraph"/>
+      </w:pPr>
+      <w:r>
+        <w:t xml:space="preserve">Открыть</w:t>
       </w:r>
       <w:r>
         <w:t xml:space="preserve"> </w:t>
@@ -2072,25 +2418,121 @@
         <w:rPr>
           <w:rStyle w:val="VerbatimChar"/>
         </w:rPr>
-        <w:t xml:space="preserve">0.0.0.0:8800</w:t>
-      </w:r>
-      <w:r>
-        <w:t xml:space="preserve"> </w:t>
-      </w:r>
-      <w:r>
-        <w:t xml:space="preserve">на GPU-сервере, доступ — через SSH-туннель</w:t>
-      </w:r>
-      <w:r>
-        <w:t xml:space="preserve"> </w:t>
-      </w:r>
-      <w:r>
-        <w:t xml:space="preserve">(проброс порта). Пароль от прокси-сервера передаётся организаторам</w:t>
-      </w:r>
-      <w:r>
-        <w:t xml:space="preserve"> </w:t>
-      </w:r>
-      <w:r>
-        <w:t xml:space="preserve">отдельно, вне репозитория:</w:t>
+        <w:t xml:space="preserve">http://localhost:5500</w:t>
+      </w:r>
+      <w:r>
+        <w:t xml:space="preserve"> </w:t>
+      </w:r>
+      <w:r>
+        <w:t xml:space="preserve">— по умолчанию сайт уже настроен ходить на</w:t>
+      </w:r>
+      <w:r>
+        <w:t xml:space="preserve"> </w:t>
+      </w:r>
+      <w:r>
+        <w:rPr>
+          <w:rStyle w:val="VerbatimChar"/>
+        </w:rPr>
+        <w:t xml:space="preserve">http://localhost:8800</w:t>
+      </w:r>
+      <w:r>
+        <w:t xml:space="preserve"> </w:t>
+      </w:r>
+      <w:r>
+        <w:t xml:space="preserve">(см.</w:t>
+      </w:r>
+      <w:r>
+        <w:t xml:space="preserve"> </w:t>
+      </w:r>
+      <w:r>
+        <w:rPr>
+          <w:rStyle w:val="VerbatimChar"/>
+        </w:rPr>
+        <w:t xml:space="preserve">web/.env.example</w:t>
+      </w:r>
+      <w:r>
+        <w:t xml:space="preserve">; переопределяется через</w:t>
+      </w:r>
+      <w:r>
+        <w:t xml:space="preserve"> </w:t>
+      </w:r>
+      <w:r>
+        <w:rPr>
+          <w:rStyle w:val="VerbatimChar"/>
+        </w:rPr>
+        <w:t xml:space="preserve">VITE_API_BASE</w:t>
+      </w:r>
+      <w:r>
+        <w:t xml:space="preserve"> </w:t>
+      </w:r>
+      <w:r>
+        <w:t xml:space="preserve">при сборке или</w:t>
+      </w:r>
+      <w:r>
+        <w:t xml:space="preserve"> </w:t>
+      </w:r>
+      <w:r>
+        <w:rPr>
+          <w:rStyle w:val="VerbatimChar"/>
+        </w:rPr>
+        <w:t xml:space="preserve">?api=http://host:port</w:t>
+      </w:r>
+      <w:r>
+        <w:t xml:space="preserve"> </w:t>
+      </w:r>
+      <w:r>
+        <w:t xml:space="preserve">в адресе страницы).</w:t>
+      </w:r>
+      <w:r>
+        <w:t xml:space="preserve"> </w:t>
+      </w:r>
+      <w:r>
+        <w:rPr>
+          <w:rStyle w:val="VerbatimChar"/>
+        </w:rPr>
+        <w:t xml:space="preserve">GET /health</w:t>
+      </w:r>
+      <w:r>
+        <w:t xml:space="preserve"> </w:t>
+      </w:r>
+      <w:r>
+        <w:t xml:space="preserve">должен ответить</w:t>
+      </w:r>
+      <w:r>
+        <w:t xml:space="preserve"> </w:t>
+      </w:r>
+      <w:r>
+        <w:rPr>
+          <w:rStyle w:val="VerbatimChar"/>
+        </w:rPr>
+        <w:t xml:space="preserve">{"status":"ok","index_size":57}</w:t>
+      </w:r>
+      <w:r>
+        <w:t xml:space="preserve">.</w:t>
+      </w:r>
+    </w:p>
+    <w:bookmarkEnd w:id="18"/>
+    <w:bookmarkStart w:id="19" w:name="X2ef4e9e0c1a9eb29fca5c60648dc0a777c4204d"/>
+    <w:p>
+      <w:pPr>
+        <w:pStyle w:val="Heading2"/>
+      </w:pPr>
+      <w:r>
+        <w:t xml:space="preserve">Способ 2 — быстрый просмотр через наш сервер</w:t>
+      </w:r>
+    </w:p>
+    <w:p>
+      <w:pPr>
+        <w:pStyle w:val="FirstParagraph"/>
+      </w:pPr>
+      <w:r>
+        <w:t xml:space="preserve">Инференс уже запущен нами на A100 — для просмотра без разворачивания</w:t>
+      </w:r>
+      <w:r>
+        <w:t xml:space="preserve"> </w:t>
+      </w:r>
+      <w:r>
+        <w:t xml:space="preserve">своей GPU достаточно поднять только веб-клиент и пробросить порт:</w:t>
       </w:r>
     </w:p>
     <w:p>
@@ -2160,120 +2602,127 @@
         </w:rPr>
         <w:t xml:space="preserve"># ждём {"status":"ok",...}</w:t>
       </w:r>
+      <w:r>
+        <w:br/>
+      </w:r>
+      <w:r>
+        <w:br/>
+      </w:r>
+      <w:r>
+        <w:rPr>
+          <w:rStyle w:val="BuiltInTok"/>
+        </w:rPr>
+        <w:t xml:space="preserve">cd</w:t>
+      </w:r>
+      <w:r>
+        <w:rPr>
+          <w:rStyle w:val="NormalTok"/>
+        </w:rPr>
+        <w:t xml:space="preserve"> web </w:t>
+      </w:r>
+      <w:r>
+        <w:rPr>
+          <w:rStyle w:val="KeywordTok"/>
+        </w:rPr>
+        <w:t xml:space="preserve">&amp;&amp;</w:t>
+      </w:r>
+      <w:r>
+        <w:rPr>
+          <w:rStyle w:val="NormalTok"/>
+        </w:rPr>
+        <w:t xml:space="preserve"> </w:t>
+      </w:r>
+      <w:r>
+        <w:rPr>
+          <w:rStyle w:val="ExtensionTok"/>
+        </w:rPr>
+        <w:t xml:space="preserve">npm</w:t>
+      </w:r>
+      <w:r>
+        <w:rPr>
+          <w:rStyle w:val="NormalTok"/>
+        </w:rPr>
+        <w:t xml:space="preserve"> install </w:t>
+      </w:r>
+      <w:r>
+        <w:rPr>
+          <w:rStyle w:val="KeywordTok"/>
+        </w:rPr>
+        <w:t xml:space="preserve">&amp;&amp;</w:t>
+      </w:r>
+      <w:r>
+        <w:rPr>
+          <w:rStyle w:val="NormalTok"/>
+        </w:rPr>
+        <w:t xml:space="preserve"> </w:t>
+      </w:r>
+      <w:r>
+        <w:rPr>
+          <w:rStyle w:val="ExtensionTok"/>
+        </w:rPr>
+        <w:t xml:space="preserve">npm</w:t>
+      </w:r>
+      <w:r>
+        <w:rPr>
+          <w:rStyle w:val="NormalTok"/>
+        </w:rPr>
+        <w:t xml:space="preserve"> run build </w:t>
+      </w:r>
+      <w:r>
+        <w:rPr>
+          <w:rStyle w:val="KeywordTok"/>
+        </w:rPr>
+        <w:t xml:space="preserve">&amp;&amp;</w:t>
+      </w:r>
+      <w:r>
+        <w:rPr>
+          <w:rStyle w:val="NormalTok"/>
+        </w:rPr>
+        <w:t xml:space="preserve"> </w:t>
+      </w:r>
+      <w:r>
+        <w:rPr>
+          <w:rStyle w:val="ExtensionTok"/>
+        </w:rPr>
+        <w:t xml:space="preserve">npx</w:t>
+      </w:r>
+      <w:r>
+        <w:rPr>
+          <w:rStyle w:val="NormalTok"/>
+        </w:rPr>
+        <w:t xml:space="preserve"> vite preview </w:t>
+      </w:r>
+      <w:r>
+        <w:rPr>
+          <w:rStyle w:val="AttributeTok"/>
+        </w:rPr>
+        <w:t xml:space="preserve">--port</w:t>
+      </w:r>
+      <w:r>
+        <w:rPr>
+          <w:rStyle w:val="NormalTok"/>
+        </w:rPr>
+        <w:t xml:space="preserve"> 5500</w:t>
+      </w:r>
     </w:p>
     <w:p>
       <w:pPr>
         <w:pStyle w:val="FirstParagraph"/>
       </w:pPr>
       <w:r>
-        <w:t xml:space="preserve">Скрипт сам переподнимает туннель, если тот оборвётся — рассчитан именно</w:t>
-      </w:r>
-      <w:r>
-        <w:t xml:space="preserve"> </w:t>
-      </w:r>
-      <w:r>
-        <w:t xml:space="preserve">на показ вживую.</w:t>
-      </w:r>
-    </w:p>
-    <w:bookmarkEnd w:id="17"/>
-    <w:bookmarkStart w:id="18" w:name="запустить-сайт"/>
-    <w:p>
-      <w:pPr>
-        <w:pStyle w:val="Heading2"/>
-      </w:pPr>
-      <w:r>
-        <w:t xml:space="preserve">2. Запустить сайт</w:t>
-      </w:r>
-    </w:p>
-    <w:p>
-      <w:pPr>
-        <w:pStyle w:val="SourceCode"/>
-      </w:pPr>
-      <w:r>
-        <w:rPr>
-          <w:rStyle w:val="BuiltInTok"/>
-        </w:rPr>
-        <w:t xml:space="preserve">cd</w:t>
-      </w:r>
-      <w:r>
-        <w:rPr>
-          <w:rStyle w:val="NormalTok"/>
-        </w:rPr>
-        <w:t xml:space="preserve"> web</w:t>
-      </w:r>
-      <w:r>
-        <w:br/>
-      </w:r>
-      <w:r>
-        <w:rPr>
-          <w:rStyle w:val="ExtensionTok"/>
-        </w:rPr>
-        <w:t xml:space="preserve">npm</w:t>
-      </w:r>
-      <w:r>
-        <w:rPr>
-          <w:rStyle w:val="NormalTok"/>
-        </w:rPr>
-        <w:t xml:space="preserve"> install</w:t>
-      </w:r>
-      <w:r>
-        <w:br/>
-      </w:r>
-      <w:r>
-        <w:rPr>
-          <w:rStyle w:val="ExtensionTok"/>
-        </w:rPr>
-        <w:t xml:space="preserve">npm</w:t>
-      </w:r>
-      <w:r>
-        <w:rPr>
-          <w:rStyle w:val="NormalTok"/>
-        </w:rPr>
-        <w:t xml:space="preserve"> run build </w:t>
-      </w:r>
-      <w:r>
-        <w:rPr>
-          <w:rStyle w:val="KeywordTok"/>
-        </w:rPr>
-        <w:t xml:space="preserve">&amp;&amp;</w:t>
-      </w:r>
-      <w:r>
-        <w:rPr>
-          <w:rStyle w:val="NormalTok"/>
-        </w:rPr>
-        <w:t xml:space="preserve"> </w:t>
-      </w:r>
-      <w:r>
-        <w:rPr>
-          <w:rStyle w:val="ExtensionTok"/>
-        </w:rPr>
-        <w:t xml:space="preserve">npx</w:t>
-      </w:r>
-      <w:r>
-        <w:rPr>
-          <w:rStyle w:val="NormalTok"/>
-        </w:rPr>
-        <w:t xml:space="preserve"> vite preview </w:t>
-      </w:r>
-      <w:r>
-        <w:rPr>
-          <w:rStyle w:val="AttributeTok"/>
-        </w:rPr>
-        <w:t xml:space="preserve">--port</w:t>
-      </w:r>
-      <w:r>
-        <w:rPr>
-          <w:rStyle w:val="NormalTok"/>
-        </w:rPr>
-        <w:t xml:space="preserve"> 5500</w:t>
-      </w:r>
-    </w:p>
-    <w:p>
-      <w:pPr>
-        <w:pStyle w:val="FirstParagraph"/>
-      </w:pPr>
-      <w:r>
-        <w:t xml:space="preserve">Открыть</w:t>
+        <w:t xml:space="preserve">Пароль от прокси-сервера передаётся организаторам отдельно, вне</w:t>
+      </w:r>
+      <w:r>
+        <w:t xml:space="preserve"> </w:t>
+      </w:r>
+      <w:r>
+        <w:t xml:space="preserve">репозитория. Скрипт сам переподнимает туннель, если тот оборвётся.</w:t>
+      </w:r>
+      <w:r>
+        <w:t xml:space="preserve"> </w:t>
+      </w:r>
+      <w:r>
+        <w:t xml:space="preserve">Подробности и план на случай сбоя — в</w:t>
       </w:r>
       <w:r>
         <w:t xml:space="preserve"> </w:t>
@@ -2282,101 +2731,15 @@
         <w:rPr>
           <w:rStyle w:val="VerbatimChar"/>
         </w:rPr>
-        <w:t xml:space="preserve">http://localhost:5500</w:t>
-      </w:r>
-      <w:r>
-        <w:t xml:space="preserve"> </w:t>
-      </w:r>
-      <w:r>
-        <w:t xml:space="preserve">— по умолчанию сайт уже настроен ходить</w:t>
-      </w:r>
-      <w:r>
-        <w:t xml:space="preserve"> </w:t>
-      </w:r>
-      <w:r>
-        <w:t xml:space="preserve">на</w:t>
-      </w:r>
-      <w:r>
-        <w:t xml:space="preserve"> </w:t>
-      </w:r>
-      <w:r>
-        <w:rPr>
-          <w:rStyle w:val="VerbatimChar"/>
-        </w:rPr>
-        <w:t xml:space="preserve">http://localhost:8800</w:t>
-      </w:r>
-      <w:r>
-        <w:t xml:space="preserve"> </w:t>
-      </w:r>
-      <w:r>
-        <w:t xml:space="preserve">(см.</w:t>
-      </w:r>
-      <w:r>
-        <w:t xml:space="preserve"> </w:t>
-      </w:r>
-      <w:r>
-        <w:rPr>
-          <w:rStyle w:val="VerbatimChar"/>
-        </w:rPr>
-        <w:t xml:space="preserve">web/.env.example</w:t>
-      </w:r>
-      <w:r>
-        <w:t xml:space="preserve">, переопределяется через</w:t>
-      </w:r>
-      <w:r>
-        <w:t xml:space="preserve"> </w:t>
-      </w:r>
-      <w:r>
-        <w:rPr>
-          <w:rStyle w:val="VerbatimChar"/>
-        </w:rPr>
-        <w:t xml:space="preserve">VITE_API_BASE</w:t>
-      </w:r>
-      <w:r>
-        <w:t xml:space="preserve"> </w:t>
-      </w:r>
-      <w:r>
-        <w:t xml:space="preserve">или</w:t>
-      </w:r>
-      <w:r>
-        <w:t xml:space="preserve"> </w:t>
-      </w:r>
-      <w:r>
-        <w:rPr>
-          <w:rStyle w:val="VerbatimChar"/>
-        </w:rPr>
-        <w:t xml:space="preserve">?api=http://host:port</w:t>
-      </w:r>
-      <w:r>
-        <w:t xml:space="preserve"> </w:t>
-      </w:r>
-      <w:r>
-        <w:t xml:space="preserve">в адресе страницы).</w:t>
-      </w:r>
-    </w:p>
-    <w:p>
-      <w:pPr>
-        <w:pStyle w:val="BodyText"/>
-      </w:pPr>
-      <w:r>
-        <w:t xml:space="preserve">Подробности и план на случай сбоя — в</w:t>
-      </w:r>
-      <w:r>
-        <w:t xml:space="preserve"> </w:t>
-      </w:r>
-      <w:r>
-        <w:rPr>
-          <w:rStyle w:val="VerbatimChar"/>
-        </w:rPr>
         <w:t xml:space="preserve">web/README.md</w:t>
       </w:r>
       <w:r>
         <w:t xml:space="preserve">.</w:t>
       </w:r>
     </w:p>
-    <w:bookmarkEnd w:id="18"/>
     <w:bookmarkEnd w:id="19"/>
-    <w:bookmarkStart w:id="20" w:name="известные-ограничения-и-план-развития"/>
+    <w:bookmarkEnd w:id="20"/>
+    <w:bookmarkStart w:id="21" w:name="известные-ограничения-и-план-развития"/>
     <w:p>
       <w:pPr>
         <w:pStyle w:val="Heading1"/>
@@ -2642,7 +3005,7 @@
         <w:t xml:space="preserve">по одному запросу.</w:t>
       </w:r>
     </w:p>
-    <w:bookmarkEnd w:id="20"/>
+    <w:bookmarkEnd w:id="21"/>
     <w:sectPr>
       <w:footnotePr>
         <w:numRestart w:val="eachSect"/>

</xml_diff>

<commit_message>
Fix pip install order: torch (CUDA wheel) before requirements.txt
requirements.txt already pins torch>=2.3, so installing it second would
pull a plain-PyPI build first and only line 2 gets a chance to override
it with the CUDA one -- confusing and occasionally the first install
fails outright if the CUDA-only version range has no manylinux wheel on
the default index.
</commit_message>
<xml_diff>
--- a/presentation/DOCUMENTATION.docx
+++ b/presentation/DOCUMENTATION.docx
@@ -2185,6 +2185,24 @@
       </w:r>
       <w:r>
         <w:rPr>
+          <w:rStyle w:val="CommentTok"/>
+        </w:rPr>
+        <w:t xml:space="preserve"># сначала torch под CUDA (или cpu-сборка) — иначе requirements.txt ниже</w:t>
+      </w:r>
+      <w:r>
+        <w:br/>
+      </w:r>
+      <w:r>
+        <w:rPr>
+          <w:rStyle w:val="CommentTok"/>
+        </w:rPr>
+        <w:t xml:space="preserve"># подтянет torch с обычного PyPI и поставит не тот билд</w:t>
+      </w:r>
+      <w:r>
+        <w:br/>
+      </w:r>
+      <w:r>
+        <w:rPr>
           <w:rStyle w:val="ExtensionTok"/>
         </w:rPr>
         <w:t xml:space="preserve">pip</w:t>
@@ -2193,6 +2211,33 @@
         <w:rPr>
           <w:rStyle w:val="NormalTok"/>
         </w:rPr>
+        <w:t xml:space="preserve"> install torch torchvision </w:t>
+      </w:r>
+      <w:r>
+        <w:rPr>
+          <w:rStyle w:val="AttributeTok"/>
+        </w:rPr>
+        <w:t xml:space="preserve">--index-url</w:t>
+      </w:r>
+      <w:r>
+        <w:rPr>
+          <w:rStyle w:val="NormalTok"/>
+        </w:rPr>
+        <w:t xml:space="preserve"> https://download.pytorch.org/whl/cu121</w:t>
+      </w:r>
+      <w:r>
+        <w:br/>
+      </w:r>
+      <w:r>
+        <w:rPr>
+          <w:rStyle w:val="ExtensionTok"/>
+        </w:rPr>
+        <w:t xml:space="preserve">pip</w:t>
+      </w:r>
+      <w:r>
+        <w:rPr>
+          <w:rStyle w:val="NormalTok"/>
+        </w:rPr>
         <w:t xml:space="preserve"> install </w:t>
       </w:r>
       <w:r>
@@ -2206,39 +2251,6 @@
           <w:rStyle w:val="NormalTok"/>
         </w:rPr>
         <w:t xml:space="preserve"> requirements.txt</w:t>
-      </w:r>
-      <w:r>
-        <w:br/>
-      </w:r>
-      <w:r>
-        <w:rPr>
-          <w:rStyle w:val="ExtensionTok"/>
-        </w:rPr>
-        <w:t xml:space="preserve">pip</w:t>
-      </w:r>
-      <w:r>
-        <w:rPr>
-          <w:rStyle w:val="NormalTok"/>
-        </w:rPr>
-        <w:t xml:space="preserve"> install torch torchvision </w:t>
-      </w:r>
-      <w:r>
-        <w:rPr>
-          <w:rStyle w:val="AttributeTok"/>
-        </w:rPr>
-        <w:t xml:space="preserve">--index-url</w:t>
-      </w:r>
-      <w:r>
-        <w:rPr>
-          <w:rStyle w:val="NormalTok"/>
-        </w:rPr>
-        <w:t xml:space="preserve"> https://download.pytorch.org/whl/cu121  </w:t>
-      </w:r>
-      <w:r>
-        <w:rPr>
-          <w:rStyle w:val="CommentTok"/>
-        </w:rPr>
-        <w:t xml:space="preserve"># или cpu-сборка</w:t>
       </w:r>
       <w:r>
         <w:br/>

</xml_diff>